<commit_message>
docs: regenerate Word deploy guide with host-portable storage
</commit_message>
<xml_diff>
--- a/DEPLOY.docx
+++ b/DEPLOY.docx
@@ -15,7 +15,7 @@
         <w:jc w:val="left"/>
       </w:pPr>
       <w:r>
-        <w:t>A step-by-step guide to getting the app live on Render's free tier, with a NeoN PostgreSQL database and Cloudflare R2 for photo storage. Allow about 30 minutes the first time.</w:t>
+        <w:t>A step-by-step guide to getting the app live on Render's free tier, with a NeoN PostgreSQL database and Cloudflare R2 for photo storage. Allow about 30 minutes the first time. Note: nothing here is Render-specific — the same steps (env vars + migrations) work on any PHP 8.4 host; Render is shown as one example.</w:t>
       </w:r>
     </w:p>
     <w:p>
@@ -691,7 +691,7 @@
           </w:tcPr>
           <w:p>
             <w:r>
-              <w:t>r2</w:t>
+              <w:t>public  (the single disk the app uses; R2 when R2_BUCKET is set)</w:t>
             </w:r>
           </w:p>
         </w:tc>

</xml_diff>

<commit_message>
docs: placeholder env values and three free-tier email options in Word guide
</commit_message>
<xml_diff>
--- a/DEPLOY.docx
+++ b/DEPLOY.docx
@@ -15,7 +15,7 @@
         <w:jc w:val="left"/>
       </w:pPr>
       <w:r>
-        <w:t>A step-by-step guide to getting the app live on Render's free tier, with a NeoN PostgreSQL database and Cloudflare R2 for photo storage. Allow about 30 minutes the first time. Note: nothing here is Render-specific — the same steps (env vars + migrations) work on any PHP 8.4 host; Render is shown as one example.</w:t>
+        <w:t>A step-by-step guide to getting the app live, with a PostgreSQL database and Cloudflare R2 for photo storage. Allow about 30 minutes the first time. Nothing here is hosting-specific — the same steps (env vars + migrations) work on any PHP 8.4 host; Render's free tier is shown as one example.</w:t>
       </w:r>
     </w:p>
     <w:p>
@@ -47,7 +47,7 @@
         <w:pStyle w:val="ListBullet"/>
       </w:pPr>
       <w:r>
-        <w:t>Render account</w:t>
+        <w:t>Render account (or any PHP 8.4 host)</w:t>
       </w:r>
     </w:p>
     <w:p>
@@ -55,7 +55,7 @@
         <w:pStyle w:val="ListBullet"/>
       </w:pPr>
       <w:r>
-        <w:t>Brevo account</w:t>
+        <w:t>Email provider account (free tier): Brevo, Resend, or Gmail App Password — pick one</w:t>
       </w:r>
     </w:p>
     <w:p>
@@ -93,7 +93,7 @@
         <w:t xml:space="preserve">2. </w:t>
       </w:r>
       <w:r>
-        <w:t>Name it "property-custodian-system". Region: APAC (Singapore).</w:t>
+        <w:t>Name it &lt;your-bucket-name&gt;. Region: APAC (Singapore).</w:t>
       </w:r>
     </w:p>
     <w:p>
@@ -197,7 +197,7 @@
         <w:t xml:space="preserve">1. </w:t>
       </w:r>
       <w:r>
-        <w:t>Create a free account at render.com → New → Web Service.</w:t>
+        <w:t>Render is shown as one example host — the same steps work on any PHP 8.4 hosting.</w:t>
       </w:r>
     </w:p>
     <w:p>
@@ -208,7 +208,7 @@
         <w:t xml:space="preserve">2. </w:t>
       </w:r>
       <w:r>
-        <w:t>Connect your Git repo and choose the branch to deploy.</w:t>
+        <w:t>Create a free account at render.com → New → Web Service.</w:t>
       </w:r>
     </w:p>
     <w:p>
@@ -219,7 +219,7 @@
         <w:t xml:space="preserve">3. </w:t>
       </w:r>
       <w:r>
-        <w:t>Runtime: Docker (Render builds the repo's Dockerfile automatically).</w:t>
+        <w:t>Connect your Git repo and choose the branch to deploy.</w:t>
       </w:r>
     </w:p>
     <w:p>
@@ -230,7 +230,7 @@
         <w:t xml:space="preserve">4. </w:t>
       </w:r>
       <w:r>
-        <w:t>Instance type: Free.</w:t>
+        <w:t>Runtime: Docker (Render builds the repo's Dockerfile automatically).</w:t>
       </w:r>
     </w:p>
     <w:p>
@@ -241,6 +241,17 @@
         <w:t xml:space="preserve">5. </w:t>
       </w:r>
       <w:r>
+        <w:t>Instance type: Free.</w:t>
+      </w:r>
+    </w:p>
+    <w:p>
+      <w:r>
+        <w:rPr>
+          <w:b/>
+        </w:rPr>
+        <w:t xml:space="preserve">6. </w:t>
+      </w:r>
+      <w:r>
         <w:t>Coat the service with the env vars in the table below, then Deploy.</w:t>
       </w:r>
     </w:p>
@@ -249,7 +260,7 @@
         <w:rPr>
           <w:b/>
         </w:rPr>
-        <w:t xml:space="preserve">6. </w:t>
+        <w:t xml:space="preserve">7. </w:t>
       </w:r>
       <w:r>
         <w:t>First boot automatically runs database migrations and seeds the built-in data (see docker/entrypoint.sh).</w:t>
@@ -271,7 +282,7 @@
         <w:t xml:space="preserve">1. </w:t>
       </w:r>
       <w:r>
-        <w:t>Render's free tier sleeps after 15 minutes of no traffic and takes 30–60 s to wake up. A pinger poaches that.</w:t>
+        <w:t>Render's free tier sleeps after 15 minutes of no traffic and takes 30–60 s to wake up. A pinger keeps it awake.</w:t>
       </w:r>
     </w:p>
     <w:p>
@@ -293,7 +304,7 @@
         <w:t xml:space="preserve">3. </w:t>
       </w:r>
       <w:r>
-        <w:t>URL to hit: https://coredevpcs.onrender.com/login</w:t>
+        <w:t>URL to hit: https://&lt;your-domain&gt;/login</w:t>
       </w:r>
     </w:p>
     <w:p>
@@ -323,7 +334,7 @@
         <w:t xml:space="preserve">1. </w:t>
       </w:r>
       <w:r>
-        <w:t>Open https://coredevpcs.onrender.com/login and register / sign in.</w:t>
+        <w:t>Open https://&lt;your-domain&gt;/login and register / sign in.</w:t>
       </w:r>
     </w:p>
     <w:p>
@@ -334,7 +345,7 @@
         <w:t xml:space="preserve">2. </w:t>
       </w:r>
       <w:r>
-        <w:t>Trigger a verification / OTP email and confirm it lands in the inbox (uses Brevo).</w:t>
+        <w:t>Trigger a verification / OTP email and confirm it lands in the inbox.</w:t>
       </w:r>
     </w:p>
     <w:p>
@@ -356,7 +367,7 @@
         <w:t xml:space="preserve">4. </w:t>
       </w:r>
       <w:r>
-        <w:t>Open the custodian dashboard — the stats and recent activity render (no 502).</w:t>
+        <w:t>Open the custodian dashboard — the stats and recent activity render (no 500 or 502).</w:t>
       </w:r>
     </w:p>
     <w:p>
@@ -364,12 +375,12 @@
         <w:pStyle w:val="Heading1"/>
       </w:pPr>
       <w:r>
-        <w:t>Environment variables (paste into Render)</w:t>
+        <w:t>Environment variables (paste into your host)</w:t>
       </w:r>
     </w:p>
     <w:p>
       <w:r>
-        <w:t>Render web service → Environment → add each line below. Everything already filled in stays as-is.</w:t>
+        <w:t>In Render: web service → Environment. On any other host: the same values go in .env or the host's secret store. Fill every &lt;placeholder&gt; and blank with your own values.</w:t>
       </w:r>
     </w:p>
     <w:p>
@@ -385,9 +396,9 @@
         <w:br/>
         <w:t>APP_DEBUG=false</w:t>
         <w:br/>
-        <w:t>APP_URL=https://coredevpcs.onrender.com</w:t>
+        <w:t>APP_URL=https://&lt;your-domain&gt;</w:t>
         <w:br/>
-        <w:t>TZ=Asia/Manila</w:t>
+        <w:t>TZ=&lt;your-timezone&gt;</w:t>
       </w:r>
     </w:p>
     <w:tbl>
@@ -493,7 +504,7 @@
           </w:tcPr>
           <w:p>
             <w:r>
-              <w:t>___  Generate: in the Render shell run  php artisan key:generate --show</w:t>
+              <w:t>___  Run  php artisan key:generate --show  and paste the output</w:t>
             </w:r>
           </w:p>
         </w:tc>
@@ -515,7 +526,7 @@
           </w:tcPr>
           <w:p>
             <w:r>
-              <w:t>https://coredevpcs.onrender.com</w:t>
+              <w:t>https://&lt;your-domain&gt;  (must be the public URL users visit)</w:t>
             </w:r>
           </w:p>
         </w:tc>
@@ -537,7 +548,7 @@
           </w:tcPr>
           <w:p>
             <w:r>
-              <w:t>Asia/Manila</w:t>
+              <w:t>&lt;your-timezone&gt;</w:t>
             </w:r>
           </w:p>
         </w:tc>
@@ -581,7 +592,7 @@
           </w:tcPr>
           <w:p>
             <w:r>
-              <w:t>ep-soft-frog-b31ccs2s-pooler.c-4.ap-southeast-1.aws.neon.tech</w:t>
+              <w:t>&lt;pooled-host&gt;.neon.tech</w:t>
             </w:r>
           </w:p>
         </w:tc>
@@ -625,7 +636,7 @@
           </w:tcPr>
           <w:p>
             <w:r>
-              <w:t>neondb</w:t>
+              <w:t>&lt;database-name&gt;</w:t>
             </w:r>
           </w:p>
         </w:tc>
@@ -647,7 +658,7 @@
           </w:tcPr>
           <w:p>
             <w:r>
-              <w:t>neondb_owner</w:t>
+              <w:t>&lt;database-user&gt;</w:t>
             </w:r>
           </w:p>
         </w:tc>
@@ -691,7 +702,7 @@
           </w:tcPr>
           <w:p>
             <w:r>
-              <w:t>public  (the single disk the app uses; R2 when R2_BUCKET is set)</w:t>
+              <w:t>public  (the single disk the app uses; becomes R2 when R2_BUCKET is set)</w:t>
             </w:r>
           </w:p>
         </w:tc>
@@ -757,7 +768,7 @@
           </w:tcPr>
           <w:p>
             <w:r>
-              <w:t>property-custodian-system</w:t>
+              <w:t>&lt;your-bucket-name&gt;</w:t>
             </w:r>
           </w:p>
         </w:tc>
@@ -779,7 +790,7 @@
           </w:tcPr>
           <w:p>
             <w:r>
-              <w:t>https://f739b2736f11fcda69d3f89a2b6b8b3c.r2.cloudflarestorage.com</w:t>
+              <w:t>https://&lt;ACCOUNT_ID&gt;.r2.cloudflarestorage.com</w:t>
             </w:r>
           </w:p>
         </w:tc>
@@ -901,72 +912,6 @@
           </w:tcPr>
           <w:p>
             <w:r>
-              <w:t>MAIL_MAILER</w:t>
-            </w:r>
-          </w:p>
-        </w:tc>
-        <w:tc>
-          <w:tcPr>
-            <w:tcW w:type="dxa" w:w="4320"/>
-          </w:tcPr>
-          <w:p>
-            <w:r>
-              <w:t>brevo</w:t>
-            </w:r>
-          </w:p>
-        </w:tc>
-      </w:tr>
-      <w:tr>
-        <w:tc>
-          <w:tcPr>
-            <w:tcW w:type="dxa" w:w="4320"/>
-          </w:tcPr>
-          <w:p>
-            <w:r>
-              <w:t>BREVO_API_KEY</w:t>
-            </w:r>
-          </w:p>
-        </w:tc>
-        <w:tc>
-          <w:tcPr>
-            <w:tcW w:type="dxa" w:w="4320"/>
-          </w:tcPr>
-          <w:p>
-            <w:r>
-              <w:t>___  Brevo → Developers → API Keys</w:t>
-            </w:r>
-          </w:p>
-        </w:tc>
-      </w:tr>
-      <w:tr>
-        <w:tc>
-          <w:tcPr>
-            <w:tcW w:type="dxa" w:w="4320"/>
-          </w:tcPr>
-          <w:p>
-            <w:r>
-              <w:t>MAIL_FROM_ADDRESS</w:t>
-            </w:r>
-          </w:p>
-        </w:tc>
-        <w:tc>
-          <w:tcPr>
-            <w:tcW w:type="dxa" w:w="4320"/>
-          </w:tcPr>
-          <w:p>
-            <w:r>
-              <w:t>coredev.anchorjavearnejo@gmail.com</w:t>
-            </w:r>
-          </w:p>
-        </w:tc>
-      </w:tr>
-      <w:tr>
-        <w:tc>
-          <w:tcPr>
-            <w:tcW w:type="dxa" w:w="4320"/>
-          </w:tcPr>
-          <w:p>
-            <w:r>
               <w:t>MAIL_FROM_NAME</w:t>
             </w:r>
           </w:p>
@@ -985,7 +930,7 @@
     </w:tbl>
     <w:p>
       <w:r>
-        <w:t>Secrets are left as ___ — fill them in from the account dashboards. Then press Save &amp; Deploy.</w:t>
+        <w:t>Secrets and account values are blanks — fill each one in from the account dashboards, then save and deploy.</w:t>
       </w:r>
     </w:p>
     <w:p>
@@ -993,12 +938,151 @@
         <w:pStyle w:val="Heading1"/>
       </w:pPr>
       <w:r>
-        <w:t>Email note</w:t>
+        <w:t>Email — choose one provider (all free tiers)</w:t>
       </w:r>
     </w:p>
     <w:p>
+      <w:pPr>
+        <w:pStyle w:val="Heading2"/>
+      </w:pPr>
       <w:r>
-        <w:t>Mail goes through Brevo's API (not SMTP — free Render egress blocks Gmail-style SMTP). After adding BREVO_API_KEY, verify the sender address coredev.anchorjavearnejo@gmail.com in Brevo → Settings → Senders. A 401 means a wrong API key; a 400 "sender not verified" means the sender step is pending.</w:t>
+        <w:t>Option A — Brevo (recommended) — free ~300 emails/day</w:t>
+      </w:r>
+    </w:p>
+    <w:p>
+      <w:pPr>
+        <w:pStyle w:val="ListBullet"/>
+      </w:pPr>
+      <w:r>
+        <w:t>API-based, so it rides HTTPS 443 and works on any host including Render's free tier.</w:t>
+      </w:r>
+    </w:p>
+    <w:p>
+      <w:pPr>
+        <w:pStyle w:val="ListBullet"/>
+      </w:pPr>
+      <w:r>
+        <w:t>Create a free account at brevo.com → Developers → API Keys, then Settings → Senders and verify the sender email.</w:t>
+      </w:r>
+    </w:p>
+    <w:p>
+      <w:pPr>
+        <w:pStyle w:val="ListBullet"/>
+      </w:pPr>
+      <w:r>
+        <w:t>A 401 means a wrong API key; a 400 "sender not verified" means the sender step is pending.</w:t>
+      </w:r>
+    </w:p>
+    <w:p>
+      <w:pPr>
+        <w:spacing w:after="80"/>
+      </w:pPr>
+      <w:r>
+        <w:rPr>
+          <w:rFonts w:ascii="Consolas" w:hAnsi="Consolas"/>
+          <w:sz w:val="20"/>
+        </w:rPr>
+        <w:t>MAIL_MAILER=brevo</w:t>
+        <w:br/>
+        <w:t>BREVO_API_KEY=&lt;your-brevo-api-key&gt;</w:t>
+        <w:br/>
+        <w:t>MAIL_FROM_ADDRESS=&lt;sender-email-verified-in-brevo&gt;</w:t>
+      </w:r>
+    </w:p>
+    <w:p>
+      <w:pPr>
+        <w:pStyle w:val="Heading2"/>
+      </w:pPr>
+      <w:r>
+        <w:t>Option B — Resend — free 3,000 emails/month</w:t>
+      </w:r>
+    </w:p>
+    <w:p>
+      <w:pPr>
+        <w:pStyle w:val="ListBullet"/>
+      </w:pPr>
+      <w:r>
+        <w:t>API-based. Requires the native package: composer require resend/resend-php.</w:t>
+      </w:r>
+    </w:p>
+    <w:p>
+      <w:pPr>
+        <w:pStyle w:val="ListBullet"/>
+      </w:pPr>
+      <w:r>
+        <w:t>Free sandbox (sender onboarding@resend.dev) delivers ONLY to the inbox your Resend account uses — real recipients need a verified domain.</w:t>
+      </w:r>
+    </w:p>
+    <w:p>
+      <w:pPr>
+        <w:spacing w:after="80"/>
+      </w:pPr>
+      <w:r>
+        <w:rPr>
+          <w:rFonts w:ascii="Consolas" w:hAnsi="Consolas"/>
+          <w:sz w:val="20"/>
+        </w:rPr>
+        <w:t>MAIL_MAILER=resend</w:t>
+        <w:br/>
+        <w:t>RESEND_API_KEY=&lt;your-resend-api-key&gt;</w:t>
+        <w:br/>
+        <w:t>MAIL_FROM_ADDRESS=no-reply@&lt;your-verified-domain&gt;</w:t>
+      </w:r>
+    </w:p>
+    <w:p>
+      <w:pPr>
+        <w:pStyle w:val="Heading2"/>
+      </w:pPr>
+      <w:r>
+        <w:t>Option C — Gmail SMTP — free (~500 emails/day with an existing Google account)</w:t>
+      </w:r>
+    </w:p>
+    <w:p>
+      <w:pPr>
+        <w:pStyle w:val="ListBullet"/>
+      </w:pPr>
+      <w:r>
+        <w:t>Turn on 2-Step Verification and create an App Password for the app.</w:t>
+      </w:r>
+    </w:p>
+    <w:p>
+      <w:pPr>
+        <w:pStyle w:val="ListBullet"/>
+      </w:pPr>
+      <w:r>
+        <w:t>MAIL_FROM_ADDRESS must exactly equal MAIL_USERNAME, or Gmail rejects with 550 "Sender address rejected".</w:t>
+      </w:r>
+    </w:p>
+    <w:p>
+      <w:pPr>
+        <w:pStyle w:val="ListBullet"/>
+      </w:pPr>
+      <w:r>
+        <w:t>Note: on Render's free tier outbound SMTP is frequently blocked/stalled (504) — the API options above are the reliable choice there. On VPS/shared hosting SMTP normally works.</w:t>
+      </w:r>
+    </w:p>
+    <w:p>
+      <w:pPr>
+        <w:spacing w:after="80"/>
+      </w:pPr>
+      <w:r>
+        <w:rPr>
+          <w:rFonts w:ascii="Consolas" w:hAnsi="Consolas"/>
+          <w:sz w:val="20"/>
+        </w:rPr>
+        <w:t>MAIL_MAILER=smtp</w:t>
+        <w:br/>
+        <w:t>MAIL_HOST=smtp.gmail.com</w:t>
+        <w:br/>
+        <w:t>MAIL_PORT=587</w:t>
+        <w:br/>
+        <w:t>MAIL_ENCRYPTION=tls</w:t>
+        <w:br/>
+        <w:t>MAIL_USERNAME=&lt;your-gmail-address&gt;</w:t>
+        <w:br/>
+        <w:t>MAIL_PASSWORD=&lt;gmail-app-password&gt;</w:t>
+        <w:br/>
+        <w:t>MAIL_FROM_ADDRESS=&lt;your-gmail-address&gt;</w:t>
       </w:r>
     </w:p>
     <w:p>

</xml_diff>